<commit_message>
docs: update correspondence email to official VIT-AP university student email
</commit_message>
<xml_diff>
--- a/cover_letter.docx
+++ b/cover_letter.docx
@@ -63,7 +63,7 @@
           <w:color w:val="333333"/>
           <w:sz w:val="22"/>
         </w:rPr>
-        <w:t>dudekula.kasimvali@outlook.com</w:t>
+        <w:t>kasim.22bcb7285@vitapstudent.ac.in</w:t>
       </w:r>
     </w:p>
     <w:p>
@@ -545,7 +545,6 @@
     <w:p>
       <w:pPr>
         <w:spacing w:line="276" w:lineRule="auto" w:after="160"/>
-        <w:jc w:val="left"/>
       </w:pPr>
       <w:r>
         <w:rPr>
@@ -555,7 +554,7 @@
           <w:color w:val="333333"/>
           <w:sz w:val="22"/>
         </w:rPr>
-        <w:t>dudekula.kasimvali@outlook.com</w:t>
+        <w:t>kasim.22bcb7285@vitapstudent.ac.in</w:t>
       </w:r>
     </w:p>
     <w:sectPr>

</xml_diff>